<commit_message>
Finalização da 3ª entrega de Database
</commit_message>
<xml_diff>
--- a/DataBase/2TDSPJ_2025_Proj_Gustavo_Molina.docx
+++ b/DataBase/2TDSPJ_2025_Proj_Gustavo_Molina.docx
@@ -664,16 +664,7 @@
           <w:szCs w:val="24"/>
           <w:lang w:val="pt-BR"/>
         </w:rPr>
-        <w:t>Aplicar boas práticas de documentação e tratamento de erros</w:t>
-      </w:r>
-      <w:r>
-        <w:rPr>
-          <w:rFonts w:ascii="Arial" w:hAnsi="Arial" w:cs="Arial"/>
-          <w:sz w:val="24"/>
-          <w:szCs w:val="24"/>
-          <w:lang w:val="pt-BR"/>
-        </w:rPr>
-        <w:t xml:space="preserve"> </w:t>
+        <w:t xml:space="preserve">Aplicar boas práticas de documentação e tratamento de erros </w:t>
       </w:r>
     </w:p>
     <w:p>
@@ -730,18 +721,7 @@
           <w:szCs w:val="27"/>
           <w:lang w:val="pt-BR"/>
         </w:rPr>
-        <w:t xml:space="preserve">3. </w:t>
-      </w:r>
-      <w:r>
-        <w:rPr>
-          <w:rFonts w:ascii="Arial" w:eastAsia="Times New Roman" w:hAnsi="Arial" w:cs="Arial"/>
-          <w:b/>
-          <w:bCs/>
-          <w:sz w:val="27"/>
-          <w:szCs w:val="27"/>
-          <w:lang w:val="pt-BR"/>
-        </w:rPr>
-        <w:t>Estrutura do Banco de Dados</w:t>
+        <w:t>3. Estrutura do Banco de Dados</w:t>
       </w:r>
     </w:p>
     <w:p>
@@ -1774,9 +1754,12 @@
           <w:szCs w:val="27"/>
           <w:lang w:val="pt-BR"/>
         </w:rPr>
-        <w:t xml:space="preserve"> </w:t>
-      </w:r>
-      <w:r>
+        <w:t xml:space="preserve"> Funções Desenvolvidas</w:t>
+      </w:r>
+    </w:p>
+    <w:p>
+      <w:pPr>
+        <w:spacing w:before="100" w:beforeAutospacing="1" w:after="100" w:afterAutospacing="1" w:line="360" w:lineRule="auto"/>
         <w:rPr>
           <w:rFonts w:ascii="Arial" w:eastAsia="Times New Roman" w:hAnsi="Arial" w:cs="Arial"/>
           <w:b/>
@@ -1785,12 +1768,8 @@
           <w:szCs w:val="27"/>
           <w:lang w:val="pt-BR"/>
         </w:rPr>
-        <w:t>Funções Desenvolvidas</w:t>
-      </w:r>
-    </w:p>
-    <w:p>
-      <w:pPr>
-        <w:spacing w:before="100" w:beforeAutospacing="1" w:after="100" w:afterAutospacing="1" w:line="360" w:lineRule="auto"/>
+      </w:pPr>
+      <w:r>
         <w:rPr>
           <w:rFonts w:ascii="Arial" w:eastAsia="Times New Roman" w:hAnsi="Arial" w:cs="Arial"/>
           <w:b/>
@@ -1799,7 +1778,8 @@
           <w:szCs w:val="27"/>
           <w:lang w:val="pt-BR"/>
         </w:rPr>
-      </w:pPr>
+        <w:t xml:space="preserve">4.1 </w:t>
+      </w:r>
       <w:r>
         <w:rPr>
           <w:rFonts w:ascii="Arial" w:eastAsia="Times New Roman" w:hAnsi="Arial" w:cs="Arial"/>
@@ -1809,7 +1789,99 @@
           <w:szCs w:val="27"/>
           <w:lang w:val="pt-BR"/>
         </w:rPr>
-        <w:t xml:space="preserve">4.1 </w:t>
+        <w:t>Função 1: Conversão Manual para JSON</w:t>
+      </w:r>
+    </w:p>
+    <w:p>
+      <w:pPr>
+        <w:spacing w:before="100" w:beforeAutospacing="1" w:after="100" w:afterAutospacing="1" w:line="360" w:lineRule="auto"/>
+        <w:rPr>
+          <w:rFonts w:ascii="Arial" w:hAnsi="Arial" w:cs="Arial"/>
+          <w:sz w:val="24"/>
+          <w:szCs w:val="24"/>
+          <w:lang w:val="pt-BR"/>
+        </w:rPr>
+      </w:pPr>
+      <w:r>
+        <w:rPr>
+          <w:rFonts w:ascii="Arial" w:hAnsi="Arial" w:cs="Arial"/>
+          <w:sz w:val="24"/>
+          <w:szCs w:val="24"/>
+          <w:lang w:val="pt-BR"/>
+        </w:rPr>
+        <w:t>Propósito: Converter dados relacionais em formato JSON sem usar funções nativas do Oracle.</w:t>
+      </w:r>
+      <w:r>
+        <w:rPr>
+          <w:rFonts w:ascii="Arial" w:hAnsi="Arial" w:cs="Arial"/>
+          <w:sz w:val="24"/>
+          <w:szCs w:val="24"/>
+          <w:lang w:val="pt-BR"/>
+        </w:rPr>
+        <w:br/>
+        <w:t xml:space="preserve">• Realiza JOIN entre tabelas moto, </w:t>
+      </w:r>
+      <w:proofErr w:type="spellStart"/>
+      <w:r>
+        <w:rPr>
+          <w:rFonts w:ascii="Arial" w:hAnsi="Arial" w:cs="Arial"/>
+          <w:sz w:val="24"/>
+          <w:szCs w:val="24"/>
+          <w:lang w:val="pt-BR"/>
+        </w:rPr>
+        <w:t>patio</w:t>
+      </w:r>
+      <w:proofErr w:type="spellEnd"/>
+      <w:r>
+        <w:rPr>
+          <w:rFonts w:ascii="Arial" w:hAnsi="Arial" w:cs="Arial"/>
+          <w:sz w:val="24"/>
+          <w:szCs w:val="24"/>
+          <w:lang w:val="pt-BR"/>
+        </w:rPr>
+        <w:t xml:space="preserve">, filial e </w:t>
+      </w:r>
+      <w:proofErr w:type="spellStart"/>
+      <w:r>
+        <w:rPr>
+          <w:rFonts w:ascii="Arial" w:hAnsi="Arial" w:cs="Arial"/>
+          <w:sz w:val="24"/>
+          <w:szCs w:val="24"/>
+          <w:lang w:val="pt-BR"/>
+        </w:rPr>
+        <w:t>statusmoto</w:t>
+      </w:r>
+      <w:proofErr w:type="spellEnd"/>
+      <w:r>
+        <w:rPr>
+          <w:rFonts w:ascii="Arial" w:hAnsi="Arial" w:cs="Arial"/>
+          <w:sz w:val="24"/>
+          <w:szCs w:val="24"/>
+          <w:lang w:val="pt-BR"/>
+        </w:rPr>
+        <w:br/>
+        <w:t xml:space="preserve">• Constrói JSON manualmente através de concatenação de </w:t>
+      </w:r>
+      <w:proofErr w:type="spellStart"/>
+      <w:r>
+        <w:rPr>
+          <w:rFonts w:ascii="Arial" w:hAnsi="Arial" w:cs="Arial"/>
+          <w:sz w:val="24"/>
+          <w:szCs w:val="24"/>
+          <w:lang w:val="pt-BR"/>
+        </w:rPr>
+        <w:t>strings</w:t>
+      </w:r>
+      <w:proofErr w:type="spellEnd"/>
+      <w:r>
+        <w:rPr>
+          <w:rFonts w:ascii="Arial" w:hAnsi="Arial" w:cs="Arial"/>
+          <w:sz w:val="24"/>
+          <w:szCs w:val="24"/>
+          <w:lang w:val="pt-BR"/>
+        </w:rPr>
+        <w:br/>
+        <w:t>• Trata 3 exceções específicas: TABELA_INEXISTENTE,</w:t>
       </w:r>
       <w:r>
         <w:rPr>
@@ -1820,7 +1892,16 @@
           <w:szCs w:val="27"/>
           <w:lang w:val="pt-BR"/>
         </w:rPr>
-        <w:t>Função 1: Conversão Manual para JSON</w:t>
+        <w:t xml:space="preserve"> </w:t>
+      </w:r>
+      <w:r>
+        <w:rPr>
+          <w:rFonts w:ascii="Arial" w:hAnsi="Arial" w:cs="Arial"/>
+          <w:sz w:val="24"/>
+          <w:szCs w:val="24"/>
+          <w:lang w:val="pt-BR"/>
+        </w:rPr>
+        <w:t>CONSULTA_INVALIDA, DADOS_INSUFICIENTES</w:t>
       </w:r>
     </w:p>
     <w:p>
@@ -1840,36 +1921,7 @@
           <w:szCs w:val="24"/>
           <w:lang w:val="pt-BR"/>
         </w:rPr>
-        <w:t>Propósito: Converter dados relacionais em formato JSON sem usar funções nativas do Oracle.</w:t>
-      </w:r>
-      <w:r>
-        <w:rPr>
-          <w:rFonts w:ascii="Arial" w:hAnsi="Arial" w:cs="Arial"/>
-          <w:sz w:val="24"/>
-          <w:szCs w:val="24"/>
-          <w:lang w:val="pt-BR"/>
-        </w:rPr>
-        <w:br/>
-      </w:r>
-      <w:proofErr w:type="gramStart"/>
-      <w:r>
-        <w:rPr>
-          <w:rFonts w:ascii="Arial" w:hAnsi="Arial" w:cs="Arial"/>
-          <w:sz w:val="24"/>
-          <w:szCs w:val="24"/>
-          <w:lang w:val="pt-BR"/>
-        </w:rPr>
-        <w:t>• Realiza</w:t>
-      </w:r>
-      <w:proofErr w:type="gramEnd"/>
-      <w:r>
-        <w:rPr>
-          <w:rFonts w:ascii="Arial" w:hAnsi="Arial" w:cs="Arial"/>
-          <w:sz w:val="24"/>
-          <w:szCs w:val="24"/>
-          <w:lang w:val="pt-BR"/>
-        </w:rPr>
-        <w:t xml:space="preserve"> JOIN entre tabelas moto, </w:t>
+        <w:t xml:space="preserve">• Suporta filtros opcionais via parâmetro </w:t>
       </w:r>
       <w:proofErr w:type="spellStart"/>
       <w:r>
@@ -1879,80 +1931,9 @@
           <w:szCs w:val="24"/>
           <w:lang w:val="pt-BR"/>
         </w:rPr>
-        <w:t>patio</w:t>
+        <w:t>p_condicao</w:t>
       </w:r>
       <w:proofErr w:type="spellEnd"/>
-      <w:r>
-        <w:rPr>
-          <w:rFonts w:ascii="Arial" w:hAnsi="Arial" w:cs="Arial"/>
-          <w:sz w:val="24"/>
-          <w:szCs w:val="24"/>
-          <w:lang w:val="pt-BR"/>
-        </w:rPr>
-        <w:t xml:space="preserve">, filial e </w:t>
-      </w:r>
-      <w:proofErr w:type="spellStart"/>
-      <w:r>
-        <w:rPr>
-          <w:rFonts w:ascii="Arial" w:hAnsi="Arial" w:cs="Arial"/>
-          <w:sz w:val="24"/>
-          <w:szCs w:val="24"/>
-          <w:lang w:val="pt-BR"/>
-        </w:rPr>
-        <w:t>statusmoto</w:t>
-      </w:r>
-      <w:proofErr w:type="spellEnd"/>
-      <w:r>
-        <w:rPr>
-          <w:rFonts w:ascii="Arial" w:hAnsi="Arial" w:cs="Arial"/>
-          <w:sz w:val="24"/>
-          <w:szCs w:val="24"/>
-          <w:lang w:val="pt-BR"/>
-        </w:rPr>
-        <w:br/>
-        <w:t xml:space="preserve">• Constrói JSON manualmente através de concatenação de </w:t>
-      </w:r>
-      <w:proofErr w:type="spellStart"/>
-      <w:r>
-        <w:rPr>
-          <w:rFonts w:ascii="Arial" w:hAnsi="Arial" w:cs="Arial"/>
-          <w:sz w:val="24"/>
-          <w:szCs w:val="24"/>
-          <w:lang w:val="pt-BR"/>
-        </w:rPr>
-        <w:t>strings</w:t>
-      </w:r>
-      <w:proofErr w:type="spellEnd"/>
-      <w:r>
-        <w:rPr>
-          <w:rFonts w:ascii="Arial" w:hAnsi="Arial" w:cs="Arial"/>
-          <w:sz w:val="24"/>
-          <w:szCs w:val="24"/>
-          <w:lang w:val="pt-BR"/>
-        </w:rPr>
-        <w:br/>
-        <w:t>• Trata 3 exceções específicas: TABELA_INEXISTENTE,</w:t>
-      </w:r>
-      <w:r>
-        <w:rPr>
-          <w:rFonts w:ascii="Arial" w:eastAsia="Times New Roman" w:hAnsi="Arial" w:cs="Arial"/>
-          <w:b/>
-          <w:bCs/>
-          <w:sz w:val="27"/>
-          <w:szCs w:val="27"/>
-          <w:lang w:val="pt-BR"/>
-        </w:rPr>
-        <w:t xml:space="preserve"> </w:t>
-      </w:r>
-      <w:r>
-        <w:rPr>
-          <w:rFonts w:ascii="Arial" w:hAnsi="Arial" w:cs="Arial"/>
-          <w:sz w:val="24"/>
-          <w:szCs w:val="24"/>
-          <w:lang w:val="pt-BR"/>
-        </w:rPr>
-        <w:t>CONSULTA_INVALIDA, DADOS_INSUFICIENTES</w:t>
-      </w:r>
     </w:p>
     <w:p>
       <w:pPr>
@@ -1964,26 +1945,6 @@
           <w:lang w:val="pt-BR"/>
         </w:rPr>
       </w:pPr>
-      <w:r>
-        <w:rPr>
-          <w:rFonts w:ascii="Arial" w:hAnsi="Arial" w:cs="Arial"/>
-          <w:sz w:val="24"/>
-          <w:szCs w:val="24"/>
-          <w:lang w:val="pt-BR"/>
-        </w:rPr>
-        <w:t xml:space="preserve">• Suporta filtros opcionais via parâmetro </w:t>
-      </w:r>
-      <w:proofErr w:type="spellStart"/>
-      <w:r>
-        <w:rPr>
-          <w:rFonts w:ascii="Arial" w:hAnsi="Arial" w:cs="Arial"/>
-          <w:sz w:val="24"/>
-          <w:szCs w:val="24"/>
-          <w:lang w:val="pt-BR"/>
-        </w:rPr>
-        <w:t>p_condicao</w:t>
-      </w:r>
-      <w:proofErr w:type="spellEnd"/>
     </w:p>
     <w:p>
       <w:pPr>
@@ -2006,20 +1967,10 @@
           <w:lang w:val="pt-BR"/>
         </w:rPr>
       </w:pPr>
-    </w:p>
-    <w:p>
-      <w:pPr>
-        <w:spacing w:before="100" w:beforeAutospacing="1" w:after="100" w:afterAutospacing="1" w:line="360" w:lineRule="auto"/>
-        <w:rPr>
-          <w:rFonts w:ascii="Arial" w:hAnsi="Arial" w:cs="Arial"/>
-          <w:sz w:val="24"/>
-          <w:szCs w:val="24"/>
-          <w:lang w:val="pt-BR"/>
-        </w:rPr>
-      </w:pPr>
-      <w:r>
-        <w:rPr>
-          <w:rFonts w:ascii="Arial" w:hAnsi="Arial" w:cs="Arial"/>
+      <w:r>
+        <w:rPr>
+          <w:rFonts w:ascii="Arial" w:hAnsi="Arial" w:cs="Arial"/>
+          <w:noProof/>
           <w:sz w:val="24"/>
           <w:szCs w:val="24"/>
           <w:lang w:val="pt-BR"/>
@@ -2181,17 +2132,7 @@
           <w:szCs w:val="24"/>
           <w:lang w:val="pt-BR"/>
         </w:rPr>
-        <w:t>validar_placa_</w:t>
-      </w:r>
-      <w:proofErr w:type="gramStart"/>
-      <w:r>
-        <w:rPr>
-          <w:rFonts w:ascii="Arial" w:hAnsi="Arial" w:cs="Arial"/>
-          <w:sz w:val="24"/>
-          <w:szCs w:val="24"/>
-          <w:lang w:val="pt-BR"/>
-        </w:rPr>
-        <w:t>moto</w:t>
+        <w:t>validar_placa_moto</w:t>
       </w:r>
       <w:proofErr w:type="spellEnd"/>
       <w:r>
@@ -2203,7 +2144,6 @@
         </w:rPr>
         <w:t>(</w:t>
       </w:r>
-      <w:proofErr w:type="gramEnd"/>
       <w:r>
         <w:rPr>
           <w:rFonts w:ascii="Arial" w:hAnsi="Arial" w:cs="Arial"/>
@@ -2355,6 +2295,7 @@
       <w:r>
         <w:rPr>
           <w:rFonts w:ascii="Arial" w:hAnsi="Arial" w:cs="Arial"/>
+          <w:noProof/>
           <w:sz w:val="24"/>
           <w:szCs w:val="24"/>
           <w:lang w:val="pt-BR"/>
@@ -2816,6 +2757,7 @@
       <w:r>
         <w:rPr>
           <w:rFonts w:ascii="Arial" w:hAnsi="Arial" w:cs="Arial"/>
+          <w:noProof/>
           <w:sz w:val="24"/>
           <w:szCs w:val="24"/>
           <w:lang w:val="pt-BR"/>
@@ -2888,18 +2830,7 @@
           <w:szCs w:val="27"/>
           <w:lang w:val="pt-BR"/>
         </w:rPr>
-        <w:t xml:space="preserve">5.2 </w:t>
-      </w:r>
-      <w:r>
-        <w:rPr>
-          <w:rFonts w:ascii="Arial" w:eastAsia="Times New Roman" w:hAnsi="Arial" w:cs="Arial"/>
-          <w:b/>
-          <w:bCs/>
-          <w:sz w:val="27"/>
-          <w:szCs w:val="27"/>
-          <w:lang w:val="pt-BR"/>
-        </w:rPr>
-        <w:t>Procedimento 2: Relatório de Custos de Manutenção</w:t>
+        <w:t>5.2 Procedimento 2: Relatório de Custos de Manutenção</w:t>
       </w:r>
     </w:p>
     <w:p>
@@ -3052,6 +2983,7 @@
       <w:r>
         <w:rPr>
           <w:rFonts w:ascii="Arial" w:hAnsi="Arial" w:cs="Arial"/>
+          <w:noProof/>
           <w:sz w:val="24"/>
           <w:szCs w:val="24"/>
           <w:lang w:val="pt-BR"/>
@@ -3106,6 +3038,7 @@
       <w:r>
         <w:rPr>
           <w:rFonts w:ascii="Arial" w:hAnsi="Arial" w:cs="Arial"/>
+          <w:noProof/>
           <w:sz w:val="24"/>
           <w:szCs w:val="24"/>
           <w:lang w:val="pt-BR"/>
@@ -3150,6 +3083,16 @@
     <w:p>
       <w:pPr>
         <w:rPr>
+          <w:rFonts w:ascii="Arial" w:hAnsi="Arial" w:cs="Arial"/>
+          <w:sz w:val="24"/>
+          <w:szCs w:val="24"/>
+          <w:lang w:val="pt-BR"/>
+        </w:rPr>
+      </w:pPr>
+    </w:p>
+    <w:p>
+      <w:pPr>
+        <w:rPr>
           <w:rFonts w:ascii="Arial" w:eastAsia="Times New Roman" w:hAnsi="Arial" w:cs="Arial"/>
           <w:b/>
           <w:bCs/>
@@ -3158,9 +3101,555 @@
           <w:lang w:val="pt-BR"/>
         </w:rPr>
       </w:pPr>
+      <w:r>
+        <w:rPr>
+          <w:rFonts w:ascii="Arial" w:eastAsia="Times New Roman" w:hAnsi="Arial" w:cs="Arial"/>
+          <w:b/>
+          <w:bCs/>
+          <w:sz w:val="27"/>
+          <w:szCs w:val="27"/>
+          <w:lang w:val="pt-BR"/>
+        </w:rPr>
+        <w:t>6.</w:t>
+      </w:r>
+      <w:r>
+        <w:rPr>
+          <w:rFonts w:ascii="Arial" w:eastAsia="Times New Roman" w:hAnsi="Arial" w:cs="Arial"/>
+          <w:b/>
+          <w:bCs/>
+          <w:sz w:val="27"/>
+          <w:szCs w:val="27"/>
+          <w:lang w:val="pt-BR"/>
+        </w:rPr>
+        <w:t xml:space="preserve"> </w:t>
+      </w:r>
+      <w:r>
+        <w:rPr>
+          <w:rFonts w:ascii="Arial" w:eastAsia="Times New Roman" w:hAnsi="Arial" w:cs="Arial"/>
+          <w:b/>
+          <w:bCs/>
+          <w:sz w:val="27"/>
+          <w:szCs w:val="27"/>
+          <w:lang w:val="pt-BR"/>
+        </w:rPr>
+        <w:t>Trigger de Auditoria</w:t>
+      </w:r>
+    </w:p>
+    <w:p>
+      <w:pPr>
+        <w:rPr>
+          <w:rFonts w:ascii="Arial" w:eastAsia="Times New Roman" w:hAnsi="Arial" w:cs="Arial"/>
+          <w:b/>
+          <w:bCs/>
+          <w:sz w:val="27"/>
+          <w:szCs w:val="27"/>
+          <w:lang w:val="pt-BR"/>
+        </w:rPr>
+      </w:pPr>
+    </w:p>
+    <w:p>
+      <w:pPr>
+        <w:rPr>
+          <w:rFonts w:ascii="Arial" w:eastAsia="Times New Roman" w:hAnsi="Arial" w:cs="Arial"/>
+          <w:b/>
+          <w:bCs/>
+          <w:sz w:val="27"/>
+          <w:szCs w:val="27"/>
+          <w:lang w:val="pt-BR"/>
+        </w:rPr>
+      </w:pPr>
+      <w:r>
+        <w:rPr>
+          <w:rFonts w:ascii="Arial" w:eastAsia="Times New Roman" w:hAnsi="Arial" w:cs="Arial"/>
+          <w:b/>
+          <w:bCs/>
+          <w:sz w:val="27"/>
+          <w:szCs w:val="27"/>
+          <w:lang w:val="pt-BR"/>
+        </w:rPr>
+        <w:t>6.1 Implementação</w:t>
+      </w:r>
+    </w:p>
+    <w:p>
+      <w:pPr>
+        <w:rPr>
+          <w:rFonts w:ascii="Arial" w:hAnsi="Arial" w:cs="Arial"/>
+          <w:sz w:val="24"/>
+          <w:szCs w:val="24"/>
+          <w:lang w:val="pt-BR"/>
+        </w:rPr>
+      </w:pPr>
+      <w:r>
+        <w:rPr>
+          <w:rFonts w:ascii="Arial" w:hAnsi="Arial" w:cs="Arial"/>
+          <w:sz w:val="24"/>
+          <w:szCs w:val="24"/>
+          <w:lang w:val="pt-BR"/>
+        </w:rPr>
+        <w:t xml:space="preserve">Trigger: </w:t>
+      </w:r>
+      <w:proofErr w:type="spellStart"/>
+      <w:r>
+        <w:rPr>
+          <w:rFonts w:ascii="Arial" w:hAnsi="Arial" w:cs="Arial"/>
+          <w:sz w:val="24"/>
+          <w:szCs w:val="24"/>
+          <w:lang w:val="pt-BR"/>
+        </w:rPr>
+        <w:t>tr_auditoria_moto</w:t>
+      </w:r>
+      <w:proofErr w:type="spellEnd"/>
+      <w:r>
+        <w:rPr>
+          <w:rFonts w:ascii="Arial" w:hAnsi="Arial" w:cs="Arial"/>
+          <w:sz w:val="24"/>
+          <w:szCs w:val="24"/>
+          <w:lang w:val="pt-BR"/>
+        </w:rPr>
+        <w:br/>
+        <w:t>Tabela Monitorada: moto</w:t>
+      </w:r>
+      <w:r>
+        <w:rPr>
+          <w:rFonts w:ascii="Arial" w:hAnsi="Arial" w:cs="Arial"/>
+          <w:sz w:val="24"/>
+          <w:szCs w:val="24"/>
+          <w:lang w:val="pt-BR"/>
+        </w:rPr>
+        <w:br/>
+        <w:t>Eventos: INSERT, UPDATE, DELETE</w:t>
+      </w:r>
+      <w:r>
+        <w:rPr>
+          <w:rFonts w:ascii="Arial" w:hAnsi="Arial" w:cs="Arial"/>
+          <w:sz w:val="24"/>
+          <w:szCs w:val="24"/>
+          <w:lang w:val="pt-BR"/>
+        </w:rPr>
+        <w:br/>
+      </w:r>
+      <w:r>
+        <w:rPr>
+          <w:rFonts w:ascii="Arial" w:hAnsi="Arial" w:cs="Arial"/>
+          <w:sz w:val="24"/>
+          <w:szCs w:val="24"/>
+          <w:lang w:val="pt-BR"/>
+        </w:rPr>
+        <w:br/>
+        <w:t>Assinatura:</w:t>
+      </w:r>
+      <w:r>
+        <w:rPr>
+          <w:rFonts w:ascii="Arial" w:hAnsi="Arial" w:cs="Arial"/>
+          <w:sz w:val="24"/>
+          <w:szCs w:val="24"/>
+          <w:lang w:val="pt-BR"/>
+        </w:rPr>
+        <w:br/>
+        <w:t xml:space="preserve">CREATE OR REPLACE TRIGGER </w:t>
+      </w:r>
+      <w:proofErr w:type="spellStart"/>
+      <w:r>
+        <w:rPr>
+          <w:rFonts w:ascii="Arial" w:hAnsi="Arial" w:cs="Arial"/>
+          <w:sz w:val="24"/>
+          <w:szCs w:val="24"/>
+          <w:lang w:val="pt-BR"/>
+        </w:rPr>
+        <w:t>tr_auditoria_moto</w:t>
+      </w:r>
+      <w:proofErr w:type="spellEnd"/>
+      <w:r>
+        <w:rPr>
+          <w:rFonts w:ascii="Arial" w:hAnsi="Arial" w:cs="Arial"/>
+          <w:sz w:val="24"/>
+          <w:szCs w:val="24"/>
+          <w:lang w:val="pt-BR"/>
+        </w:rPr>
+        <w:br/>
+        <w:t xml:space="preserve">    AFTER INSERT OR UPDATE OR DELETE ON moto</w:t>
+      </w:r>
+      <w:r>
+        <w:rPr>
+          <w:rFonts w:ascii="Arial" w:hAnsi="Arial" w:cs="Arial"/>
+          <w:sz w:val="24"/>
+          <w:szCs w:val="24"/>
+          <w:lang w:val="pt-BR"/>
+        </w:rPr>
+        <w:br/>
+        <w:t xml:space="preserve">    FOR EACH ROW</w:t>
+      </w:r>
+    </w:p>
+    <w:p>
+      <w:pPr>
+        <w:rPr>
+          <w:rFonts w:ascii="Arial" w:eastAsia="Times New Roman" w:hAnsi="Arial" w:cs="Arial"/>
+          <w:b/>
+          <w:bCs/>
+          <w:sz w:val="27"/>
+          <w:szCs w:val="27"/>
+          <w:lang w:val="pt-BR"/>
+        </w:rPr>
+      </w:pPr>
+      <w:r>
+        <w:rPr>
+          <w:rFonts w:ascii="Arial" w:eastAsia="Times New Roman" w:hAnsi="Arial" w:cs="Arial"/>
+          <w:b/>
+          <w:bCs/>
+          <w:sz w:val="27"/>
+          <w:szCs w:val="27"/>
+          <w:lang w:val="pt-BR"/>
+        </w:rPr>
+        <w:t xml:space="preserve">6.2 </w:t>
+      </w:r>
+      <w:r>
+        <w:rPr>
+          <w:rFonts w:ascii="Arial" w:eastAsia="Times New Roman" w:hAnsi="Arial" w:cs="Arial"/>
+          <w:b/>
+          <w:bCs/>
+          <w:sz w:val="27"/>
+          <w:szCs w:val="27"/>
+          <w:lang w:val="pt-BR"/>
+        </w:rPr>
+        <w:t>Tabela de Auditoria</w:t>
+      </w:r>
+    </w:p>
+    <w:p>
+      <w:pPr>
+        <w:rPr>
+          <w:rFonts w:ascii="Arial" w:hAnsi="Arial" w:cs="Arial"/>
+          <w:sz w:val="24"/>
+          <w:szCs w:val="24"/>
+          <w:lang w:val="pt-BR"/>
+        </w:rPr>
+      </w:pPr>
+      <w:r>
+        <w:rPr>
+          <w:rFonts w:ascii="Arial" w:hAnsi="Arial" w:cs="Arial"/>
+          <w:sz w:val="24"/>
+          <w:szCs w:val="24"/>
+          <w:lang w:val="pt-BR"/>
+        </w:rPr>
+        <w:t>A tabela auditoria registra:</w:t>
+      </w:r>
+      <w:r>
+        <w:rPr>
+          <w:rFonts w:ascii="Arial" w:hAnsi="Arial" w:cs="Arial"/>
+          <w:sz w:val="24"/>
+          <w:szCs w:val="24"/>
+          <w:lang w:val="pt-BR"/>
+        </w:rPr>
+        <w:br/>
+        <w:t xml:space="preserve">• </w:t>
+      </w:r>
+      <w:proofErr w:type="spellStart"/>
+      <w:r>
+        <w:rPr>
+          <w:rFonts w:ascii="Arial" w:hAnsi="Arial" w:cs="Arial"/>
+          <w:sz w:val="24"/>
+          <w:szCs w:val="24"/>
+          <w:lang w:val="pt-BR"/>
+        </w:rPr>
+        <w:t>nome_usuario</w:t>
+      </w:r>
+      <w:proofErr w:type="spellEnd"/>
+      <w:r>
+        <w:rPr>
+          <w:rFonts w:ascii="Arial" w:hAnsi="Arial" w:cs="Arial"/>
+          <w:sz w:val="24"/>
+          <w:szCs w:val="24"/>
+          <w:lang w:val="pt-BR"/>
+        </w:rPr>
+        <w:t>: Usuário que executou a operação</w:t>
+      </w:r>
+      <w:r>
+        <w:rPr>
+          <w:rFonts w:ascii="Arial" w:hAnsi="Arial" w:cs="Arial"/>
+          <w:sz w:val="24"/>
+          <w:szCs w:val="24"/>
+          <w:lang w:val="pt-BR"/>
+        </w:rPr>
+        <w:br/>
+        <w:t xml:space="preserve">• </w:t>
+      </w:r>
+      <w:proofErr w:type="spellStart"/>
+      <w:r>
+        <w:rPr>
+          <w:rFonts w:ascii="Arial" w:hAnsi="Arial" w:cs="Arial"/>
+          <w:sz w:val="24"/>
+          <w:szCs w:val="24"/>
+          <w:lang w:val="pt-BR"/>
+        </w:rPr>
+        <w:t>tipo_operacao</w:t>
+      </w:r>
+      <w:proofErr w:type="spellEnd"/>
+      <w:r>
+        <w:rPr>
+          <w:rFonts w:ascii="Arial" w:hAnsi="Arial" w:cs="Arial"/>
+          <w:sz w:val="24"/>
+          <w:szCs w:val="24"/>
+          <w:lang w:val="pt-BR"/>
+        </w:rPr>
+        <w:t>: INSERT, UPDATE ou DELETE</w:t>
+      </w:r>
+      <w:r>
+        <w:rPr>
+          <w:rFonts w:ascii="Arial" w:hAnsi="Arial" w:cs="Arial"/>
+          <w:sz w:val="24"/>
+          <w:szCs w:val="24"/>
+          <w:lang w:val="pt-BR"/>
+        </w:rPr>
+        <w:br/>
+        <w:t xml:space="preserve">• </w:t>
+      </w:r>
+      <w:proofErr w:type="spellStart"/>
+      <w:r>
+        <w:rPr>
+          <w:rFonts w:ascii="Arial" w:hAnsi="Arial" w:cs="Arial"/>
+          <w:sz w:val="24"/>
+          <w:szCs w:val="24"/>
+          <w:lang w:val="pt-BR"/>
+        </w:rPr>
+        <w:t>data_hora</w:t>
+      </w:r>
+      <w:proofErr w:type="spellEnd"/>
+      <w:r>
+        <w:rPr>
+          <w:rFonts w:ascii="Arial" w:hAnsi="Arial" w:cs="Arial"/>
+          <w:sz w:val="24"/>
+          <w:szCs w:val="24"/>
+          <w:lang w:val="pt-BR"/>
+        </w:rPr>
+        <w:t xml:space="preserve">: </w:t>
+      </w:r>
+      <w:proofErr w:type="spellStart"/>
+      <w:r>
+        <w:rPr>
+          <w:rFonts w:ascii="Arial" w:hAnsi="Arial" w:cs="Arial"/>
+          <w:sz w:val="24"/>
+          <w:szCs w:val="24"/>
+          <w:lang w:val="pt-BR"/>
+        </w:rPr>
+        <w:t>Timestamp</w:t>
+      </w:r>
+      <w:proofErr w:type="spellEnd"/>
+      <w:r>
+        <w:rPr>
+          <w:rFonts w:ascii="Arial" w:hAnsi="Arial" w:cs="Arial"/>
+          <w:sz w:val="24"/>
+          <w:szCs w:val="24"/>
+          <w:lang w:val="pt-BR"/>
+        </w:rPr>
+        <w:t xml:space="preserve"> da operação</w:t>
+      </w:r>
+      <w:r>
+        <w:rPr>
+          <w:rFonts w:ascii="Arial" w:hAnsi="Arial" w:cs="Arial"/>
+          <w:sz w:val="24"/>
+          <w:szCs w:val="24"/>
+          <w:lang w:val="pt-BR"/>
+        </w:rPr>
+        <w:br/>
+        <w:t xml:space="preserve">• </w:t>
+      </w:r>
+      <w:proofErr w:type="spellStart"/>
+      <w:r>
+        <w:rPr>
+          <w:rFonts w:ascii="Arial" w:hAnsi="Arial" w:cs="Arial"/>
+          <w:sz w:val="24"/>
+          <w:szCs w:val="24"/>
+          <w:lang w:val="pt-BR"/>
+        </w:rPr>
+        <w:t>tabela_afetada</w:t>
+      </w:r>
+      <w:proofErr w:type="spellEnd"/>
+      <w:r>
+        <w:rPr>
+          <w:rFonts w:ascii="Arial" w:hAnsi="Arial" w:cs="Arial"/>
+          <w:sz w:val="24"/>
+          <w:szCs w:val="24"/>
+          <w:lang w:val="pt-BR"/>
+        </w:rPr>
+        <w:t>: Nome da tabela (sempre 'MOTO')</w:t>
+      </w:r>
+      <w:r>
+        <w:rPr>
+          <w:rFonts w:ascii="Arial" w:hAnsi="Arial" w:cs="Arial"/>
+          <w:sz w:val="24"/>
+          <w:szCs w:val="24"/>
+          <w:lang w:val="pt-BR"/>
+        </w:rPr>
+        <w:br/>
+        <w:t xml:space="preserve">• </w:t>
+      </w:r>
+      <w:proofErr w:type="spellStart"/>
+      <w:r>
+        <w:rPr>
+          <w:rFonts w:ascii="Arial" w:hAnsi="Arial" w:cs="Arial"/>
+          <w:sz w:val="24"/>
+          <w:szCs w:val="24"/>
+          <w:lang w:val="pt-BR"/>
+        </w:rPr>
+        <w:t>valores_antigos</w:t>
+      </w:r>
+      <w:proofErr w:type="spellEnd"/>
+      <w:r>
+        <w:rPr>
+          <w:rFonts w:ascii="Arial" w:hAnsi="Arial" w:cs="Arial"/>
+          <w:sz w:val="24"/>
+          <w:szCs w:val="24"/>
+          <w:lang w:val="pt-BR"/>
+        </w:rPr>
+        <w:t>: Estado anterior dos dados (:OLD)</w:t>
+      </w:r>
+      <w:r>
+        <w:rPr>
+          <w:rFonts w:ascii="Arial" w:hAnsi="Arial" w:cs="Arial"/>
+          <w:sz w:val="24"/>
+          <w:szCs w:val="24"/>
+          <w:lang w:val="pt-BR"/>
+        </w:rPr>
+        <w:br/>
+        <w:t xml:space="preserve">• </w:t>
+      </w:r>
+      <w:proofErr w:type="spellStart"/>
+      <w:r>
+        <w:rPr>
+          <w:rFonts w:ascii="Arial" w:hAnsi="Arial" w:cs="Arial"/>
+          <w:sz w:val="24"/>
+          <w:szCs w:val="24"/>
+          <w:lang w:val="pt-BR"/>
+        </w:rPr>
+        <w:t>valores_novos</w:t>
+      </w:r>
+      <w:proofErr w:type="spellEnd"/>
+      <w:r>
+        <w:rPr>
+          <w:rFonts w:ascii="Arial" w:hAnsi="Arial" w:cs="Arial"/>
+          <w:sz w:val="24"/>
+          <w:szCs w:val="24"/>
+          <w:lang w:val="pt-BR"/>
+        </w:rPr>
+        <w:t>: Novo estado dos dados (:NEW)</w:t>
+      </w:r>
+    </w:p>
+    <w:p>
+      <w:pPr>
+        <w:rPr>
+          <w:rFonts w:ascii="Arial" w:eastAsia="Times New Roman" w:hAnsi="Arial" w:cs="Arial"/>
+          <w:b/>
+          <w:bCs/>
+          <w:sz w:val="27"/>
+          <w:szCs w:val="27"/>
+          <w:lang w:val="pt-BR"/>
+        </w:rPr>
+      </w:pPr>
+      <w:r>
+        <w:rPr>
+          <w:rFonts w:ascii="Arial" w:eastAsia="Times New Roman" w:hAnsi="Arial" w:cs="Arial"/>
+          <w:b/>
+          <w:bCs/>
+          <w:sz w:val="27"/>
+          <w:szCs w:val="27"/>
+          <w:lang w:val="pt-BR"/>
+        </w:rPr>
+        <w:drawing>
+          <wp:inline distT="0" distB="0" distL="0" distR="0" wp14:anchorId="374637E9" wp14:editId="74DB54FB">
+            <wp:extent cx="5943600" cy="2787650"/>
+            <wp:effectExtent l="0" t="0" r="0" b="0"/>
+            <wp:docPr id="8" name="Picture 8"/>
+            <wp:cNvGraphicFramePr>
+              <a:graphicFrameLocks xmlns:a="http://schemas.openxmlformats.org/drawingml/2006/main" noChangeAspect="1"/>
+            </wp:cNvGraphicFramePr>
+            <a:graphic xmlns:a="http://schemas.openxmlformats.org/drawingml/2006/main">
+              <a:graphicData uri="http://schemas.openxmlformats.org/drawingml/2006/picture">
+                <pic:pic xmlns:pic="http://schemas.openxmlformats.org/drawingml/2006/picture">
+                  <pic:nvPicPr>
+                    <pic:cNvPr id="1" name=""/>
+                    <pic:cNvPicPr/>
+                  </pic:nvPicPr>
+                  <pic:blipFill>
+                    <a:blip r:embed="rId13"/>
+                    <a:stretch>
+                      <a:fillRect/>
+                    </a:stretch>
+                  </pic:blipFill>
+                  <pic:spPr>
+                    <a:xfrm>
+                      <a:off x="0" y="0"/>
+                      <a:ext cx="5943600" cy="2787650"/>
+                    </a:xfrm>
+                    <a:prstGeom prst="rect">
+                      <a:avLst/>
+                    </a:prstGeom>
+                  </pic:spPr>
+                </pic:pic>
+              </a:graphicData>
+            </a:graphic>
+          </wp:inline>
+        </w:drawing>
+      </w:r>
+    </w:p>
+    <w:p>
+      <w:pPr>
+        <w:rPr>
+          <w:rFonts w:ascii="Arial" w:eastAsia="Times New Roman" w:hAnsi="Arial" w:cs="Arial"/>
+          <w:b/>
+          <w:bCs/>
+          <w:sz w:val="27"/>
+          <w:szCs w:val="27"/>
+          <w:lang w:val="pt-BR"/>
+        </w:rPr>
+      </w:pPr>
+      <w:r>
+        <w:rPr>
+          <w:rFonts w:ascii="Arial" w:eastAsia="Times New Roman" w:hAnsi="Arial" w:cs="Arial"/>
+          <w:b/>
+          <w:bCs/>
+          <w:sz w:val="27"/>
+          <w:szCs w:val="27"/>
+          <w:lang w:val="pt-BR"/>
+        </w:rPr>
+        <w:lastRenderedPageBreak/>
+        <w:drawing>
+          <wp:inline distT="0" distB="0" distL="0" distR="0" wp14:anchorId="045CFC30" wp14:editId="695F2D67">
+            <wp:extent cx="5943600" cy="1082040"/>
+            <wp:effectExtent l="0" t="0" r="0" b="3810"/>
+            <wp:docPr id="9" name="Picture 9"/>
+            <wp:cNvGraphicFramePr>
+              <a:graphicFrameLocks xmlns:a="http://schemas.openxmlformats.org/drawingml/2006/main" noChangeAspect="1"/>
+            </wp:cNvGraphicFramePr>
+            <a:graphic xmlns:a="http://schemas.openxmlformats.org/drawingml/2006/main">
+              <a:graphicData uri="http://schemas.openxmlformats.org/drawingml/2006/picture">
+                <pic:pic xmlns:pic="http://schemas.openxmlformats.org/drawingml/2006/picture">
+                  <pic:nvPicPr>
+                    <pic:cNvPr id="1" name=""/>
+                    <pic:cNvPicPr/>
+                  </pic:nvPicPr>
+                  <pic:blipFill>
+                    <a:blip r:embed="rId14"/>
+                    <a:stretch>
+                      <a:fillRect/>
+                    </a:stretch>
+                  </pic:blipFill>
+                  <pic:spPr>
+                    <a:xfrm>
+                      <a:off x="0" y="0"/>
+                      <a:ext cx="5943600" cy="1082040"/>
+                    </a:xfrm>
+                    <a:prstGeom prst="rect">
+                      <a:avLst/>
+                    </a:prstGeom>
+                  </pic:spPr>
+                </pic:pic>
+              </a:graphicData>
+            </a:graphic>
+          </wp:inline>
+        </w:drawing>
+      </w:r>
     </w:p>
     <w:sectPr>
-      <w:headerReference w:type="default" r:id="rId13"/>
+      <w:headerReference w:type="default" r:id="rId15"/>
       <w:pgSz w:w="12240" w:h="15840"/>
       <w:pgMar w:top="1440" w:right="1440" w:bottom="1440" w:left="1440" w:header="720" w:footer="720" w:gutter="0"/>
       <w:cols w:space="720"/>

</xml_diff>